<commit_message>
Drive buoy motion from pressure estimate
</commit_message>
<xml_diff>
--- a/THESIS DOCUMENTATION/PROJECT FALCON-01 - V3 Documentation.docx
+++ b/THESIS DOCUMENTATION/PROJECT FALCON-01 - V3 Documentation.docx
@@ -307,6 +307,7 @@
         <w:rPr/>
       </w:pPr>
       <w:r>
+        <w:rPr/>
         <w:t>4. How clearly can a simplified four-page local dashboard communicate wave, environment, GPS, power, security, health, and alert information with minimal navigation for non-technical users?</w:t>
       </w:r>
     </w:p>
@@ -473,6 +474,7 @@
         <w:rPr/>
       </w:pPr>
       <w:r>
+        <w:rPr/>
         <w:t>5. Develop a responsive dashboard with Overview, Buoy Motion, Sensors, and Logs &amp; Alerts as four primary navigation pages while clearly labeling Buoy Motion as an optional visualization rather than a required IMU measurement.</w:t>
       </w:r>
     </w:p>
@@ -521,6 +523,7 @@
         <w:rPr/>
       </w:pPr>
       <w:r>
+        <w:rPr/>
         <w:t>The study does not provide official weather, storm, typhoon, tsunami, navigation, or emergency warnings. It does not claim laboratory-grade water-quality analysis, professional oceanographic accuracy, autonomous navigation, satellite communication, camera AI, or multi-buoy operation. Internet connectivity is optional. AI wave prediction is an optional extension and not a required study outcome.</w:t>
       </w:r>
     </w:p>
@@ -942,7 +945,7 @@
               <w:rPr/>
             </w:pPr>
             <w:r>
-              <w:t>Display current state, optional motion visualization, grouped sensors, logs, and alerts</w:t>
+              <w:t>Display current state, optional pressure-driven motion visualization, grouped sensors, logs, and alerts</w:t>
             </w:r>
           </w:p>
         </w:tc>
@@ -1649,20 +1652,37 @@
     <w:p>
       <w:pPr>
         <w:pStyle w:val="Heading2"/>
-      </w:pPr>
-      <w:r>
+        <w:spacing w:before="280" w:after="280"/>
+        <w:rPr/>
+      </w:pPr>
+      <w:r>
+        <w:rPr/>
         <w:t>7.1 Water Temperature Monitoring</w:t>
       </w:r>
     </w:p>
     <w:p>
-      <w:r>
+      <w:pPr>
+        <w:pStyle w:val="Normal"/>
+        <w:rPr/>
+      </w:pPr>
+      <w:r>
+        <w:rPr/>
         <w:t>FALCON includes a sealed DS18B20 supporting sensor that reports water temperature in degrees Celsius. This channel provides environmental context and does not constitute laboratory-grade water-quality analysis.</w:t>
       </w:r>
     </w:p>
     <w:tbl>
       <w:tblPr>
-        <w:tblW w:type="auto" w:w="0"/>
-        <w:tblLook w:firstColumn="1" w:firstRow="1" w:lastColumn="0" w:lastRow="0" w:noHBand="0" w:noVBand="1" w:val="04A0"/>
+        <w:tblW w:w="9831" w:type="dxa"/>
+        <w:jc w:val="left"/>
+        <w:tblInd w:w="0" w:type="dxa"/>
+        <w:tblLayout w:type="fixed"/>
+        <w:tblCellMar>
+          <w:top w:w="0" w:type="dxa"/>
+          <w:left w:w="108" w:type="dxa"/>
+          <w:bottom w:w="0" w:type="dxa"/>
+          <w:right w:w="108" w:type="dxa"/>
+        </w:tblCellMar>
+        <w:tblLook w:val="04a0" w:noHBand="0" w:noVBand="1" w:firstColumn="1" w:lastRow="0" w:lastColumn="0" w:firstRow="1"/>
       </w:tblPr>
       <w:tblGrid>
         <w:gridCol w:w="3277"/>
@@ -1670,64 +1690,132 @@
         <w:gridCol w:w="3277"/>
       </w:tblGrid>
       <w:tr>
-        <w:tc>
-          <w:tcPr>
-            <w:tcW w:type="dxa" w:w="3277"/>
-          </w:tcPr>
-          <w:p>
-            <w:r>
+        <w:trPr/>
+        <w:tc>
+          <w:tcPr>
+            <w:tcW w:w="3277" w:type="dxa"/>
+            <w:tcBorders/>
+          </w:tcPr>
+          <w:p>
+            <w:pPr>
+              <w:pStyle w:val="Normal"/>
+              <w:widowControl/>
+              <w:suppressAutoHyphens w:val="true"/>
+              <w:bidi w:val="0"/>
+              <w:spacing w:lineRule="auto" w:line="259" w:before="0" w:after="160"/>
+              <w:jc w:val="left"/>
+              <w:rPr/>
+            </w:pPr>
+            <w:r>
+              <w:rPr/>
               <w:t>Channel</w:t>
             </w:r>
           </w:p>
         </w:tc>
         <w:tc>
           <w:tcPr>
-            <w:tcW w:type="dxa" w:w="3277"/>
-          </w:tcPr>
-          <w:p>
-            <w:r>
+            <w:tcW w:w="3277" w:type="dxa"/>
+            <w:tcBorders/>
+          </w:tcPr>
+          <w:p>
+            <w:pPr>
+              <w:pStyle w:val="Normal"/>
+              <w:widowControl/>
+              <w:suppressAutoHyphens w:val="true"/>
+              <w:bidi w:val="0"/>
+              <w:spacing w:lineRule="auto" w:line="259" w:before="0" w:after="160"/>
+              <w:jc w:val="left"/>
+              <w:rPr/>
+            </w:pPr>
+            <w:r>
+              <w:rPr/>
               <w:t>Required output</w:t>
             </w:r>
           </w:p>
         </w:tc>
         <w:tc>
           <w:tcPr>
-            <w:tcW w:type="dxa" w:w="3277"/>
-          </w:tcPr>
-          <w:p>
-            <w:r>
+            <w:tcW w:w="3277" w:type="dxa"/>
+            <w:tcBorders/>
+          </w:tcPr>
+          <w:p>
+            <w:pPr>
+              <w:pStyle w:val="Normal"/>
+              <w:widowControl/>
+              <w:suppressAutoHyphens w:val="true"/>
+              <w:bidi w:val="0"/>
+              <w:spacing w:lineRule="auto" w:line="259" w:before="0" w:after="160"/>
+              <w:jc w:val="left"/>
+              <w:rPr/>
+            </w:pPr>
+            <w:r>
+              <w:rPr/>
               <w:t>Validity and calibration rule</w:t>
             </w:r>
           </w:p>
         </w:tc>
       </w:tr>
       <w:tr>
-        <w:tc>
-          <w:tcPr>
-            <w:tcW w:type="dxa" w:w="3277"/>
-          </w:tcPr>
-          <w:p>
-            <w:r>
+        <w:trPr/>
+        <w:tc>
+          <w:tcPr>
+            <w:tcW w:w="3277" w:type="dxa"/>
+            <w:tcBorders/>
+          </w:tcPr>
+          <w:p>
+            <w:pPr>
+              <w:pStyle w:val="Normal"/>
+              <w:widowControl/>
+              <w:suppressAutoHyphens w:val="true"/>
+              <w:bidi w:val="0"/>
+              <w:spacing w:lineRule="auto" w:line="259" w:before="0" w:after="160"/>
+              <w:jc w:val="left"/>
+              <w:rPr/>
+            </w:pPr>
+            <w:r>
+              <w:rPr/>
               <w:t>Sealed DS18B20</w:t>
             </w:r>
           </w:p>
         </w:tc>
         <w:tc>
           <w:tcPr>
-            <w:tcW w:type="dxa" w:w="3277"/>
-          </w:tcPr>
-          <w:p>
-            <w:r>
+            <w:tcW w:w="3277" w:type="dxa"/>
+            <w:tcBorders/>
+          </w:tcPr>
+          <w:p>
+            <w:pPr>
+              <w:pStyle w:val="Normal"/>
+              <w:widowControl/>
+              <w:suppressAutoHyphens w:val="true"/>
+              <w:bidi w:val="0"/>
+              <w:spacing w:lineRule="auto" w:line="259" w:before="0" w:after="160"/>
+              <w:jc w:val="left"/>
+              <w:rPr/>
+            </w:pPr>
+            <w:r>
+              <w:rPr/>
               <w:t>Water temperature (°C), timestamp, validity, and freshness</w:t>
             </w:r>
           </w:p>
         </w:tc>
         <w:tc>
           <w:tcPr>
-            <w:tcW w:type="dxa" w:w="3277"/>
-          </w:tcPr>
-          <w:p>
-            <w:r>
+            <w:tcW w:w="3277" w:type="dxa"/>
+            <w:tcBorders/>
+          </w:tcPr>
+          <w:p>
+            <w:pPr>
+              <w:pStyle w:val="Normal"/>
+              <w:widowControl/>
+              <w:suppressAutoHyphens w:val="true"/>
+              <w:bidi w:val="0"/>
+              <w:spacing w:lineRule="auto" w:line="259" w:before="0" w:after="160"/>
+              <w:jc w:val="left"/>
+              <w:rPr/>
+            </w:pPr>
+            <w:r>
+              <w:rPr/>
               <w:t>Compare with a traceable reference thermometer; report OFFLINE or STALE when invalid</w:t>
             </w:r>
           </w:p>
@@ -1735,7 +1823,12 @@
       </w:tr>
     </w:tbl>
     <w:p>
-      <w:r>
+      <w:pPr>
+        <w:pStyle w:val="Normal"/>
+        <w:rPr/>
+      </w:pPr>
+      <w:r>
+        <w:rPr/>
         <w:t>The dashboard displays this channel under Water. Exact model identification, sampling, freshness, validity, and reference-comparison status remain available in expanded technical details.</w:t>
       </w:r>
     </w:p>
@@ -1788,7 +1881,7 @@
         <w:rPr/>
         <w:drawing>
           <wp:inline distT="0" distB="0" distL="0" distR="0">
-            <wp:extent cx="6080760" cy="768350"/>
+            <wp:extent cx="6080760" cy="1107440"/>
             <wp:effectExtent l="0" t="0" r="0" b="0"/>
             <wp:docPr id="2" name="Picture 2" descr=""/>
             <wp:cNvGraphicFramePr>
@@ -1812,7 +1905,7 @@
                   <pic:spPr bwMode="auto">
                     <a:xfrm>
                       <a:off x="0" y="0"/>
-                      <a:ext cx="6080760" cy="768350"/>
+                      <a:ext cx="6080760" cy="1107440"/>
                     </a:xfrm>
                     <a:prstGeom prst="rect">
                       <a:avLst/>
@@ -2578,6 +2671,7 @@
         <w:rPr/>
       </w:pPr>
       <w:r>
+        <w:rPr/>
         <w:t>The operator interface uses four primary navigation pages. Detailed diagnostics remain available through expandable views rather than one card per physical sensor.</w:t>
       </w:r>
     </w:p>
@@ -2681,7 +2775,7 @@
         <w:rPr/>
       </w:pPr>
       <w:r>
-        <w:t>2. Buoy Motion: an optional advanced/demo visualization driven by estimated sea context. It remains available in navigation but is not presented as an IMU measurement.</w:t>
+        <w:t>2. Buoy Motion: an optional 3D visualization whose water-surface amplitude, heave, and tilt are generated from pressure-based estimated wave height. GPS supplies heading context only; no IMU, roll, or pitch sensor input is used.</w:t>
       </w:r>
     </w:p>
     <w:p>
@@ -2692,6 +2786,7 @@
         <w:rPr/>
       </w:pPr>
       <w:r>
+        <w:rPr/>
         <w:t>3. Sensors: six grouped user-facing cards—Wave &amp; Pressure, GPS &amp; Security, Wind, Water, Power, and System. Technical details such as exact sensor model, sampling rate, calibration state, signal quality, and update age remain available through expandable details.</w:t>
       </w:r>
     </w:p>
@@ -2703,6 +2798,7 @@
         <w:rPr/>
       </w:pPr>
       <w:r>
+        <w:rPr/>
         <w:t>4. Logs &amp; Alerts: current warnings, security/calibration/operator events, persisted telemetry, acknowledgement, search, and export.</w:t>
       </w:r>
     </w:p>
@@ -2715,6 +2811,7 @@
         <w:rPr/>
       </w:pPr>
       <w:r>
+        <w:rPr/>
         <w:t>Settings is a compact header icon. Optional predictive AI is hidden from the default operator view. The FALCON Assistant design and animation files are preserved for future review, but the assistant is currently disabled and not displayed in the operator dashboard. If re-enabled, it shall remain optional, rule-based, concise, and independent of safety-critical monitoring.</w:t>
       </w:r>
     </w:p>
@@ -3222,7 +3319,7 @@
         <w:rPr/>
       </w:pPr>
       <w:r>
-        <w:t>The repository currently includes the ESP32 firmware shell, diagnostic portal, versioned serial frame, Python simulator/edge service, SQLite storage, deterministic alerts, grouped API, four-page dashboard, optional motion visualization, saved but disabled assistant assets, and optional presentation prediction. The software build and automated tests demonstrate implementation behavior only. They do not prove physical sensor accuracy or coastal readiness.</w:t>
+        <w:t>The repository currently includes the ESP32 firmware shell, diagnostic portal, versioned serial frame, Python simulator/edge service, SQLite storage, deterministic alerts, grouped API, four-page dashboard, optional pressure-driven motion visualization, saved but disabled assistant assets, and optional presentation prediction. The software build and automated tests demonstrate implementation behavior only. They do not prove physical sensor accuracy or coastal readiness.</w:t>
       </w:r>
     </w:p>
     <w:p>
@@ -3305,6 +3402,7 @@
         <w:rPr/>
       </w:pPr>
       <w:r>
+        <w:rPr/>
         <w:t>3. Bench-integrate Bar02, GPS, wind, DS18B20, health, and security channels.</w:t>
       </w:r>
     </w:p>
@@ -3388,6 +3486,7 @@
         <w:rPr/>
       </w:pPr>
       <w:r>
+        <w:rPr/>
         <w:t>This V3.3 implementation-aligned document supersedes conflicting V2 and earlier V3 descriptions. The repository master context is docs/PROJECT_CONTEXT.md v6.0. Older CAD, Wokwi, motion, IMU, forecast, and PCB records may remain for historical traceability but are not the current required Phase 1 baseline unless revised and explicitly approved. Sections 22–27 and Figures 1–6 are part of the current documentation baseline and must remain consistent with docs/PROJECT_CONTEXT.md and the implemented repository.</w:t>
       </w:r>
     </w:p>
@@ -3401,6 +3500,50 @@
       </w:r>
       <w:r>
         <w:br w:type="page"/>
+      </w:r>
+    </w:p>
+    <w:p>
+      <w:pPr>
+        <w:pStyle w:val="Heading1"/>
+        <w:spacing w:before="0" w:after="120"/>
+        <w:rPr/>
+      </w:pPr>
+      <w:r>
+        <w:rPr/>
+        <w:t>18. Pressure Sensor Installation and Reference Validation</w:t>
+      </w:r>
+    </w:p>
+    <w:p>
+      <w:pPr>
+        <w:pStyle w:val="Normal"/>
+        <w:spacing w:before="0" w:after="120"/>
+        <w:rPr/>
+      </w:pPr>
+      <w:r>
+        <w:rPr/>
+        <w:t>Wave-height accuracy shall be established through comparison with an independent reference method during controlled testing. The reference may be a calibrated staff gauge/video method or another suitable reference instrument. Reference measurements must be time-aligned with the pressure data. The study will report error metrics and limitations rather than assume that pressure conversion alone is accurate.</w:t>
+      </w:r>
+    </w:p>
+    <w:p>
+      <w:pPr>
+        <w:pStyle w:val="Normal"/>
+        <w:spacing w:before="0" w:after="120"/>
+        <w:rPr/>
+      </w:pPr>
+      <w:r>
+        <w:rPr/>
+        <w:t>The exact installation depth is not frozen in this document. It must be selected from the final buoy geometry, expected waterline, sensor operating range, wave conditions, and controlled test results. The installation record shall document the vertical distance from the normal waterline to the pressure-sensing element, orientation, mounting bracket, cable routing, and baseline conditions.</w:t>
+      </w:r>
+    </w:p>
+    <w:p>
+      <w:pPr>
+        <w:pStyle w:val="Normal"/>
+        <w:spacing w:before="0" w:after="120"/>
+        <w:rPr/>
+      </w:pPr>
+      <w:r>
+        <w:rPr/>
+        <w:t>The pressure sensor shall be rigidly mounted below the normal waterline at a known submerged depth on a protected fixed bracket or lower structural member. It shall not hang freely from the mooring chain or rope because uncontrolled sensor movement would add measurement noise and make installation depth uncertain.</w:t>
       </w:r>
     </w:p>
     <w:p>
@@ -3411,7 +3554,7 @@
       </w:pPr>
       <w:r>
         <w:rPr/>
-        <w:t>18. Pressure Sensor Installation and Reference Validation</w:t>
+        <w:t>19. Simplified Operator Interface and Sensor Grouping</w:t>
       </w:r>
     </w:p>
     <w:p>
@@ -3422,7 +3565,7 @@
       </w:pPr>
       <w:r>
         <w:rPr/>
-        <w:t>Wave-height accuracy shall be established through comparison with an independent reference method during controlled testing. The reference may be a calibrated staff gauge/video method or another suitable reference instrument. Reference measurements must be time-aligned with the pressure data. The study will report error metrics and limitations rather than assume that pressure conversion alone is accurate.</w:t>
+        <w:t>The Sensors page does not display one card per physical device. Individual devices are grouped into six user-facing categories: (1) Wave &amp; Pressure, (2) GPS &amp; Security, (3) Wind, (4) Water, (5) Power, and (6) System. Expanded details preserve the underlying engineering information such as exact sensor model, sample rate, signal quality, calibration state, source, and update age.</w:t>
       </w:r>
     </w:p>
     <w:p>
@@ -3433,7 +3576,7 @@
       </w:pPr>
       <w:r>
         <w:rPr/>
-        <w:t>The exact installation depth is not frozen in this document. It must be selected from the final buoy geometry, expected waterline, sensor operating range, wave conditions, and controlled test results. The installation record shall document the vertical distance from the normal waterline to the pressure-sensing element, orientation, mounting bracket, cable routing, and baseline conditions.</w:t>
+        <w:t>The default operator interface is intentionally simplified for quick use by non-technical and older users. The four navigation pages are Overview, Buoy Motion, Sensors, and Logs &amp; Alerts; Buoy Motion is explicitly optional visualization. Important information should be understandable with minimal clicking, large readable labels, high contrast, and clear status colors.</w:t>
       </w:r>
     </w:p>
     <w:p>
@@ -3444,48 +3587,6 @@
       </w:pPr>
       <w:r>
         <w:rPr/>
-        <w:t>The pressure sensor shall be rigidly mounted below the normal waterline at a known submerged depth on a protected fixed bracket or lower structural member. It shall not hang freely from the mooring chain or rope because uncontrolled sensor movement would add measurement noise and make installation depth uncertain.</w:t>
-      </w:r>
-    </w:p>
-    <w:p>
-      <w:pPr>
-        <w:pStyle w:val="Heading1"/>
-        <w:spacing w:before="200" w:after="120"/>
-        <w:rPr/>
-      </w:pPr>
-      <w:r>
-        <w:rPr/>
-        <w:t>19. Simplified Operator Interface and Sensor Grouping</w:t>
-      </w:r>
-    </w:p>
-    <w:p>
-      <w:pPr>
-        <w:pStyle w:val="Normal"/>
-        <w:spacing w:before="0" w:after="120"/>
-        <w:rPr/>
-      </w:pPr>
-      <w:r>
-        <w:rPr/>
-        <w:t>The Sensors page does not display one card per physical device. Individual devices are grouped into six user-facing categories: (1) Wave &amp; Pressure, (2) GPS &amp; Security, (3) Wind, (4) Water, (5) Power, and (6) System. Expanded details preserve the underlying engineering information such as exact sensor model, sample rate, signal quality, calibration state, source, and update age.</w:t>
-      </w:r>
-    </w:p>
-    <w:p>
-      <w:pPr>
-        <w:pStyle w:val="Normal"/>
-        <w:spacing w:before="0" w:after="120"/>
-        <w:rPr/>
-      </w:pPr>
-      <w:r>
-        <w:t>The default operator interface is intentionally simplified for quick use by non-technical and older users. The four navigation pages are Overview, Buoy Motion, Sensors, and Logs &amp; Alerts; Buoy Motion is explicitly optional visualization. Important information should be understandable with minimal clicking, large readable labels, high contrast, and clear status colors.</w:t>
-      </w:r>
-    </w:p>
-    <w:p>
-      <w:pPr>
-        <w:pStyle w:val="Normal"/>
-        <w:spacing w:before="0" w:after="120"/>
-        <w:rPr/>
-      </w:pPr>
-      <w:r>
         <w:t>The FALCON Assistant concept, mascot, and animation files are retained for possible future use, but the assistant is currently hidden from the dashboard while its final operator design is reviewed. If approved and re-enabled, it may translate existing validated system states into short explanations; it shall not create independent safety decisions.</w:t>
       </w:r>
     </w:p>
@@ -3637,20 +3738,37 @@
     <w:p>
       <w:pPr>
         <w:pStyle w:val="Heading2"/>
-      </w:pPr>
-      <w:r>
+        <w:spacing w:before="280" w:after="280"/>
+        <w:rPr/>
+      </w:pPr>
+      <w:r>
+        <w:rPr/>
         <w:t>22.1 Provisional Electronics Consumption</w:t>
       </w:r>
     </w:p>
     <w:p>
-      <w:r>
+      <w:pPr>
+        <w:pStyle w:val="Normal"/>
+        <w:rPr/>
+      </w:pPr>
+      <w:r>
+        <w:rPr/>
         <w:t>The following values are design envelopes and planning assumptions, not measured continuous consumption. Final values shall be replaced by a 24-hour current log covering Orange Pi startup, Wi-Fi activity, storage writes, sensor sampling, fan startup, and idle operation.</w:t>
       </w:r>
     </w:p>
     <w:tbl>
       <w:tblPr>
-        <w:tblW w:type="auto" w:w="0"/>
-        <w:tblLook w:firstColumn="1" w:firstRow="1" w:lastColumn="0" w:lastRow="0" w:noHBand="0" w:noVBand="1" w:val="04A0"/>
+        <w:tblW w:w="9831" w:type="dxa"/>
+        <w:jc w:val="left"/>
+        <w:tblInd w:w="0" w:type="dxa"/>
+        <w:tblLayout w:type="fixed"/>
+        <w:tblCellMar>
+          <w:top w:w="0" w:type="dxa"/>
+          <w:left w:w="108" w:type="dxa"/>
+          <w:bottom w:w="0" w:type="dxa"/>
+          <w:right w:w="108" w:type="dxa"/>
+        </w:tblCellMar>
+        <w:tblLook w:val="04a0" w:noHBand="0" w:noVBand="1" w:firstColumn="1" w:lastRow="0" w:lastColumn="0" w:firstRow="1"/>
       </w:tblPr>
       <w:tblGrid>
         <w:gridCol w:w="3277"/>
@@ -3658,192 +3776,396 @@
         <w:gridCol w:w="3277"/>
       </w:tblGrid>
       <w:tr>
-        <w:tc>
-          <w:tcPr>
-            <w:tcW w:type="dxa" w:w="3277"/>
-          </w:tcPr>
-          <w:p>
-            <w:r>
+        <w:trPr/>
+        <w:tc>
+          <w:tcPr>
+            <w:tcW w:w="3277" w:type="dxa"/>
+            <w:tcBorders/>
+          </w:tcPr>
+          <w:p>
+            <w:pPr>
+              <w:pStyle w:val="Normal"/>
+              <w:widowControl/>
+              <w:suppressAutoHyphens w:val="true"/>
+              <w:bidi w:val="0"/>
+              <w:spacing w:lineRule="auto" w:line="259" w:before="0" w:after="160"/>
+              <w:jc w:val="left"/>
+              <w:rPr/>
+            </w:pPr>
+            <w:r>
+              <w:rPr/>
               <w:t>Load</w:t>
             </w:r>
           </w:p>
         </w:tc>
         <w:tc>
           <w:tcPr>
-            <w:tcW w:type="dxa" w:w="3277"/>
-          </w:tcPr>
-          <w:p>
-            <w:r>
+            <w:tcW w:w="3277" w:type="dxa"/>
+            <w:tcBorders/>
+          </w:tcPr>
+          <w:p>
+            <w:pPr>
+              <w:pStyle w:val="Normal"/>
+              <w:widowControl/>
+              <w:suppressAutoHyphens w:val="true"/>
+              <w:bidi w:val="0"/>
+              <w:spacing w:lineRule="auto" w:line="259" w:before="0" w:after="160"/>
+              <w:jc w:val="left"/>
+              <w:rPr/>
+            </w:pPr>
+            <w:r>
+              <w:rPr/>
               <w:t>Preliminary electrical basis</w:t>
             </w:r>
           </w:p>
         </w:tc>
         <w:tc>
           <w:tcPr>
-            <w:tcW w:type="dxa" w:w="3277"/>
-          </w:tcPr>
-          <w:p>
-            <w:r>
+            <w:tcW w:w="3277" w:type="dxa"/>
+            <w:tcBorders/>
+          </w:tcPr>
+          <w:p>
+            <w:pPr>
+              <w:pStyle w:val="Normal"/>
+              <w:widowControl/>
+              <w:suppressAutoHyphens w:val="true"/>
+              <w:bidi w:val="0"/>
+              <w:spacing w:lineRule="auto" w:line="259" w:before="0" w:after="160"/>
+              <w:jc w:val="left"/>
+              <w:rPr/>
+            </w:pPr>
+            <w:r>
+              <w:rPr/>
               <w:t>Documentation status</w:t>
             </w:r>
           </w:p>
         </w:tc>
       </w:tr>
       <w:tr>
-        <w:tc>
-          <w:tcPr>
-            <w:tcW w:type="dxa" w:w="3277"/>
-          </w:tcPr>
-          <w:p>
-            <w:r>
+        <w:trPr/>
+        <w:tc>
+          <w:tcPr>
+            <w:tcW w:w="3277" w:type="dxa"/>
+            <w:tcBorders/>
+          </w:tcPr>
+          <w:p>
+            <w:pPr>
+              <w:pStyle w:val="Normal"/>
+              <w:widowControl/>
+              <w:suppressAutoHyphens w:val="true"/>
+              <w:bidi w:val="0"/>
+              <w:spacing w:lineRule="auto" w:line="259" w:before="0" w:after="160"/>
+              <w:jc w:val="left"/>
+              <w:rPr/>
+            </w:pPr>
+            <w:r>
+              <w:rPr/>
               <w:t>Orange Pi Zero 3, storage, and Wi-Fi</w:t>
             </w:r>
           </w:p>
         </w:tc>
         <w:tc>
           <w:tcPr>
-            <w:tcW w:type="dxa" w:w="3277"/>
-          </w:tcPr>
-          <w:p>
-            <w:r>
+            <w:tcW w:w="3277" w:type="dxa"/>
+            <w:tcBorders/>
+          </w:tcPr>
+          <w:p>
+            <w:pPr>
+              <w:pStyle w:val="Normal"/>
+              <w:widowControl/>
+              <w:suppressAutoHyphens w:val="true"/>
+              <w:bidi w:val="0"/>
+              <w:spacing w:lineRule="auto" w:line="259" w:before="0" w:after="160"/>
+              <w:jc w:val="left"/>
+              <w:rPr/>
+            </w:pPr>
+            <w:r>
+              <w:rPr/>
               <w:t>Regulated 5 V / 3 A supply envelope (15 W maximum available, not assumed average draw)</w:t>
             </w:r>
           </w:p>
         </w:tc>
         <w:tc>
           <w:tcPr>
-            <w:tcW w:type="dxa" w:w="3277"/>
-          </w:tcPr>
-          <w:p>
-            <w:r>
+            <w:tcW w:w="3277" w:type="dxa"/>
+            <w:tcBorders/>
+          </w:tcPr>
+          <w:p>
+            <w:pPr>
+              <w:pStyle w:val="Normal"/>
+              <w:widowControl/>
+              <w:suppressAutoHyphens w:val="true"/>
+              <w:bidi w:val="0"/>
+              <w:spacing w:lineRule="auto" w:line="259" w:before="0" w:after="160"/>
+              <w:jc w:val="left"/>
+              <w:rPr/>
+            </w:pPr>
+            <w:r>
+              <w:rPr/>
               <w:t>Measure startup peak, idle, Wi-Fi, and database-write current</w:t>
             </w:r>
           </w:p>
         </w:tc>
       </w:tr>
       <w:tr>
-        <w:tc>
-          <w:tcPr>
-            <w:tcW w:type="dxa" w:w="3277"/>
-          </w:tcPr>
-          <w:p>
-            <w:r>
+        <w:trPr/>
+        <w:tc>
+          <w:tcPr>
+            <w:tcW w:w="3277" w:type="dxa"/>
+            <w:tcBorders/>
+          </w:tcPr>
+          <w:p>
+            <w:pPr>
+              <w:pStyle w:val="Normal"/>
+              <w:widowControl/>
+              <w:suppressAutoHyphens w:val="true"/>
+              <w:bidi w:val="0"/>
+              <w:spacing w:lineRule="auto" w:line="259" w:before="0" w:after="160"/>
+              <w:jc w:val="left"/>
+              <w:rPr/>
+            </w:pPr>
+            <w:r>
+              <w:rPr/>
               <w:t>ESP32 and complete sensor carrier</w:t>
             </w:r>
           </w:p>
         </w:tc>
         <w:tc>
           <w:tcPr>
-            <w:tcW w:type="dxa" w:w="3277"/>
-          </w:tcPr>
-          <w:p>
-            <w:r>
+            <w:tcW w:w="3277" w:type="dxa"/>
+            <w:tcBorders/>
+          </w:tcPr>
+          <w:p>
+            <w:pPr>
+              <w:pStyle w:val="Normal"/>
+              <w:widowControl/>
+              <w:suppressAutoHyphens w:val="true"/>
+              <w:bidi w:val="0"/>
+              <w:spacing w:lineRule="auto" w:line="259" w:before="0" w:after="160"/>
+              <w:jc w:val="left"/>
+              <w:rPr/>
+            </w:pPr>
+            <w:r>
+              <w:rPr/>
               <w:t>Separate regulated 5 V / 2 A branch envelope (10 W maximum available)</w:t>
             </w:r>
           </w:p>
         </w:tc>
         <w:tc>
           <w:tcPr>
-            <w:tcW w:type="dxa" w:w="3277"/>
-          </w:tcPr>
-          <w:p>
-            <w:r>
+            <w:tcW w:w="3277" w:type="dxa"/>
+            <w:tcBorders/>
+          </w:tcPr>
+          <w:p>
+            <w:pPr>
+              <w:pStyle w:val="Normal"/>
+              <w:widowControl/>
+              <w:suppressAutoHyphens w:val="true"/>
+              <w:bidi w:val="0"/>
+              <w:spacing w:lineRule="auto" w:line="259" w:before="0" w:after="160"/>
+              <w:jc w:val="left"/>
+              <w:rPr/>
+            </w:pPr>
+            <w:r>
+              <w:rPr/>
               <w:t>Measure ESP32 plus every installed sensor; do not use the envelope as average consumption</w:t>
             </w:r>
           </w:p>
         </w:tc>
       </w:tr>
       <w:tr>
-        <w:tc>
-          <w:tcPr>
-            <w:tcW w:type="dxa" w:w="3277"/>
-          </w:tcPr>
-          <w:p>
-            <w:r>
+        <w:trPr/>
+        <w:tc>
+          <w:tcPr>
+            <w:tcW w:w="3277" w:type="dxa"/>
+            <w:tcBorders/>
+          </w:tcPr>
+          <w:p>
+            <w:pPr>
+              <w:pStyle w:val="Normal"/>
+              <w:widowControl/>
+              <w:suppressAutoHyphens w:val="true"/>
+              <w:bidi w:val="0"/>
+              <w:spacing w:lineRule="auto" w:line="259" w:before="0" w:after="160"/>
+              <w:jc w:val="left"/>
+              <w:rPr/>
+            </w:pPr>
+            <w:r>
+              <w:rPr/>
               <w:t>Two optional enclosure fans</w:t>
             </w:r>
           </w:p>
         </w:tc>
         <w:tc>
           <w:tcPr>
-            <w:tcW w:type="dxa" w:w="3277"/>
-          </w:tcPr>
-          <w:p>
-            <w:r>
+            <w:tcW w:w="3277" w:type="dxa"/>
+            <w:tcBorders/>
+          </w:tcPr>
+          <w:p>
+            <w:pPr>
+              <w:pStyle w:val="Normal"/>
+              <w:widowControl/>
+              <w:suppressAutoHyphens w:val="true"/>
+              <w:bidi w:val="0"/>
+              <w:spacing w:lineRule="auto" w:line="259" w:before="0" w:after="160"/>
+              <w:jc w:val="left"/>
+              <w:rPr/>
+            </w:pPr>
+            <w:r>
+              <w:rPr/>
               <w:t>2 × 5 V × 0.15 A = 1.5 W maximum</w:t>
             </w:r>
           </w:p>
         </w:tc>
         <w:tc>
           <w:tcPr>
-            <w:tcW w:type="dxa" w:w="3277"/>
-          </w:tcPr>
-          <w:p>
-            <w:r>
+            <w:tcW w:w="3277" w:type="dxa"/>
+            <w:tcBorders/>
+          </w:tcPr>
+          <w:p>
+            <w:pPr>
+              <w:pStyle w:val="Normal"/>
+              <w:widowControl/>
+              <w:suppressAutoHyphens w:val="true"/>
+              <w:bidi w:val="0"/>
+              <w:spacing w:lineRule="auto" w:line="259" w:before="0" w:after="160"/>
+              <w:jc w:val="left"/>
+              <w:rPr/>
+            </w:pPr>
+            <w:r>
+              <w:rPr/>
               <w:t>Include only if the selected fans are installed and thermally required</w:t>
             </w:r>
           </w:p>
         </w:tc>
       </w:tr>
       <w:tr>
-        <w:tc>
-          <w:tcPr>
-            <w:tcW w:type="dxa" w:w="3277"/>
-          </w:tcPr>
-          <w:p>
-            <w:r>
+        <w:trPr/>
+        <w:tc>
+          <w:tcPr>
+            <w:tcW w:w="3277" w:type="dxa"/>
+            <w:tcBorders/>
+          </w:tcPr>
+          <w:p>
+            <w:pPr>
+              <w:pStyle w:val="Normal"/>
+              <w:widowControl/>
+              <w:suppressAutoHyphens w:val="true"/>
+              <w:bidi w:val="0"/>
+              <w:spacing w:lineRule="auto" w:line="259" w:before="0" w:after="160"/>
+              <w:jc w:val="left"/>
+              <w:rPr/>
+            </w:pPr>
+            <w:r>
+              <w:rPr/>
               <w:t>Pressure, GPS, wind, water, power, and security sensors</w:t>
             </w:r>
           </w:p>
         </w:tc>
         <w:tc>
           <w:tcPr>
-            <w:tcW w:type="dxa" w:w="3277"/>
-          </w:tcPr>
-          <w:p>
-            <w:r>
+            <w:tcW w:w="3277" w:type="dxa"/>
+            <w:tcBorders/>
+          </w:tcPr>
+          <w:p>
+            <w:pPr>
+              <w:pStyle w:val="Normal"/>
+              <w:widowControl/>
+              <w:suppressAutoHyphens w:val="true"/>
+              <w:bidi w:val="0"/>
+              <w:spacing w:lineRule="auto" w:line="259" w:before="0" w:after="160"/>
+              <w:jc w:val="left"/>
+              <w:rPr/>
+            </w:pPr>
+            <w:r>
+              <w:rPr/>
               <w:t>Included in the ESP32/sensor branch</w:t>
             </w:r>
           </w:p>
         </w:tc>
         <w:tc>
           <w:tcPr>
-            <w:tcW w:type="dxa" w:w="3277"/>
-          </w:tcPr>
-          <w:p>
-            <w:r>
+            <w:tcW w:w="3277" w:type="dxa"/>
+            <w:tcBorders/>
+          </w:tcPr>
+          <w:p>
+            <w:pPr>
+              <w:pStyle w:val="Normal"/>
+              <w:widowControl/>
+              <w:suppressAutoHyphens w:val="true"/>
+              <w:bidi w:val="0"/>
+              <w:spacing w:lineRule="auto" w:line="259" w:before="0" w:after="160"/>
+              <w:jc w:val="left"/>
+              <w:rPr/>
+            </w:pPr>
+            <w:r>
+              <w:rPr/>
               <w:t>Record individual idle/active current from exact purchased datasheets and bench measurements</w:t>
             </w:r>
           </w:p>
         </w:tc>
       </w:tr>
       <w:tr>
-        <w:tc>
-          <w:tcPr>
-            <w:tcW w:type="dxa" w:w="3277"/>
-          </w:tcPr>
-          <w:p>
-            <w:r>
+        <w:trPr/>
+        <w:tc>
+          <w:tcPr>
+            <w:tcW w:w="3277" w:type="dxa"/>
+            <w:tcBorders/>
+          </w:tcPr>
+          <w:p>
+            <w:pPr>
+              <w:pStyle w:val="Normal"/>
+              <w:widowControl/>
+              <w:suppressAutoHyphens w:val="true"/>
+              <w:bidi w:val="0"/>
+              <w:spacing w:lineRule="auto" w:line="259" w:before="0" w:after="160"/>
+              <w:jc w:val="left"/>
+              <w:rPr/>
+            </w:pPr>
+            <w:r>
+              <w:rPr/>
               <w:t>DC conversion and charging losses</w:t>
             </w:r>
           </w:p>
         </w:tc>
         <w:tc>
           <w:tcPr>
-            <w:tcW w:type="dxa" w:w="3277"/>
-          </w:tcPr>
-          <w:p>
-            <w:r>
+            <w:tcW w:w="3277" w:type="dxa"/>
+            <w:tcBorders/>
+          </w:tcPr>
+          <w:p>
+            <w:pPr>
+              <w:pStyle w:val="Normal"/>
+              <w:widowControl/>
+              <w:suppressAutoHyphens w:val="true"/>
+              <w:bidi w:val="0"/>
+              <w:spacing w:lineRule="auto" w:line="259" w:before="0" w:after="160"/>
+              <w:jc w:val="left"/>
+              <w:rPr/>
+            </w:pPr>
+            <w:r>
+              <w:rPr/>
               <w:t>Included through conservative system-efficiency assumptions</w:t>
             </w:r>
           </w:p>
         </w:tc>
         <w:tc>
           <w:tcPr>
-            <w:tcW w:type="dxa" w:w="3277"/>
-          </w:tcPr>
-          <w:p>
-            <w:r>
+            <w:tcW w:w="3277" w:type="dxa"/>
+            <w:tcBorders/>
+          </w:tcPr>
+          <w:p>
+            <w:pPr>
+              <w:pStyle w:val="Normal"/>
+              <w:widowControl/>
+              <w:suppressAutoHyphens w:val="true"/>
+              <w:bidi w:val="0"/>
+              <w:spacing w:lineRule="auto" w:line="259" w:before="0" w:after="160"/>
+              <w:jc w:val="left"/>
+              <w:rPr/>
+            </w:pPr>
+            <w:r>
+              <w:rPr/>
               <w:t>Verify buck and MPPT efficiency across battery voltage, load, and enclosure temperature</w:t>
             </w:r>
           </w:p>
@@ -3853,20 +4175,37 @@
     <w:p>
       <w:pPr>
         <w:pStyle w:val="Heading2"/>
-      </w:pPr>
-      <w:r>
+        <w:spacing w:before="280" w:after="280"/>
+        <w:rPr/>
+      </w:pPr>
+      <w:r>
+        <w:rPr/>
         <w:t>22.2 Battery Capacity and Autonomy</w:t>
       </w:r>
     </w:p>
     <w:p>
-      <w:r>
+      <w:pPr>
+        <w:pStyle w:val="Normal"/>
+        <w:rPr/>
+      </w:pPr>
+      <w:r>
+        <w:rPr/>
         <w:t>The provisional baseline is a 12.8 V, 20 Ah LiFePO4 battery: 12.8 V × 20 Ah = 256 Wh nominal. Using an 80% usable-energy planning limit gives 204.8 Wh. Estimated no-solar runtime is usable energy divided by measured average load.</w:t>
       </w:r>
     </w:p>
     <w:tbl>
       <w:tblPr>
-        <w:tblW w:type="auto" w:w="0"/>
-        <w:tblLook w:firstColumn="1" w:firstRow="1" w:lastColumn="0" w:lastRow="0" w:noHBand="0" w:noVBand="1" w:val="04A0"/>
+        <w:tblW w:w="9831" w:type="dxa"/>
+        <w:jc w:val="left"/>
+        <w:tblInd w:w="0" w:type="dxa"/>
+        <w:tblLayout w:type="fixed"/>
+        <w:tblCellMar>
+          <w:top w:w="0" w:type="dxa"/>
+          <w:left w:w="108" w:type="dxa"/>
+          <w:bottom w:w="0" w:type="dxa"/>
+          <w:right w:w="108" w:type="dxa"/>
+        </w:tblCellMar>
+        <w:tblLook w:val="04a0" w:noHBand="0" w:noVBand="1" w:firstColumn="1" w:lastRow="0" w:lastColumn="0" w:firstRow="1"/>
       </w:tblPr>
       <w:tblGrid>
         <w:gridCol w:w="3277"/>
@@ -3874,128 +4213,264 @@
         <w:gridCol w:w="3277"/>
       </w:tblGrid>
       <w:tr>
-        <w:tc>
-          <w:tcPr>
-            <w:tcW w:type="dxa" w:w="3277"/>
-          </w:tcPr>
-          <w:p>
-            <w:r>
+        <w:trPr/>
+        <w:tc>
+          <w:tcPr>
+            <w:tcW w:w="3277" w:type="dxa"/>
+            <w:tcBorders/>
+          </w:tcPr>
+          <w:p>
+            <w:pPr>
+              <w:pStyle w:val="Normal"/>
+              <w:widowControl/>
+              <w:suppressAutoHyphens w:val="true"/>
+              <w:bidi w:val="0"/>
+              <w:spacing w:lineRule="auto" w:line="259" w:before="0" w:after="160"/>
+              <w:jc w:val="left"/>
+              <w:rPr/>
+            </w:pPr>
+            <w:r>
+              <w:rPr/>
               <w:t>Complete average load</w:t>
             </w:r>
           </w:p>
         </w:tc>
         <w:tc>
           <w:tcPr>
-            <w:tcW w:type="dxa" w:w="3277"/>
-          </w:tcPr>
-          <w:p>
-            <w:r>
+            <w:tcW w:w="3277" w:type="dxa"/>
+            <w:tcBorders/>
+          </w:tcPr>
+          <w:p>
+            <w:pPr>
+              <w:pStyle w:val="Normal"/>
+              <w:widowControl/>
+              <w:suppressAutoHyphens w:val="true"/>
+              <w:bidi w:val="0"/>
+              <w:spacing w:lineRule="auto" w:line="259" w:before="0" w:after="160"/>
+              <w:jc w:val="left"/>
+              <w:rPr/>
+            </w:pPr>
+            <w:r>
+              <w:rPr/>
               <w:t>Daily energy</w:t>
             </w:r>
           </w:p>
         </w:tc>
         <w:tc>
           <w:tcPr>
-            <w:tcW w:type="dxa" w:w="3277"/>
-          </w:tcPr>
-          <w:p>
-            <w:r>
+            <w:tcW w:w="3277" w:type="dxa"/>
+            <w:tcBorders/>
+          </w:tcPr>
+          <w:p>
+            <w:pPr>
+              <w:pStyle w:val="Normal"/>
+              <w:widowControl/>
+              <w:suppressAutoHyphens w:val="true"/>
+              <w:bidi w:val="0"/>
+              <w:spacing w:lineRule="auto" w:line="259" w:before="0" w:after="160"/>
+              <w:jc w:val="left"/>
+              <w:rPr/>
+            </w:pPr>
+            <w:r>
+              <w:rPr/>
               <w:t>Estimated no-solar runtime</w:t>
             </w:r>
           </w:p>
         </w:tc>
       </w:tr>
       <w:tr>
-        <w:tc>
-          <w:tcPr>
-            <w:tcW w:type="dxa" w:w="3277"/>
-          </w:tcPr>
-          <w:p>
-            <w:r>
+        <w:trPr/>
+        <w:tc>
+          <w:tcPr>
+            <w:tcW w:w="3277" w:type="dxa"/>
+            <w:tcBorders/>
+          </w:tcPr>
+          <w:p>
+            <w:pPr>
+              <w:pStyle w:val="Normal"/>
+              <w:widowControl/>
+              <w:suppressAutoHyphens w:val="true"/>
+              <w:bidi w:val="0"/>
+              <w:spacing w:lineRule="auto" w:line="259" w:before="0" w:after="160"/>
+              <w:jc w:val="left"/>
+              <w:rPr/>
+            </w:pPr>
+            <w:r>
+              <w:rPr/>
               <w:t>6 W</w:t>
             </w:r>
           </w:p>
         </w:tc>
         <w:tc>
           <w:tcPr>
-            <w:tcW w:type="dxa" w:w="3277"/>
-          </w:tcPr>
-          <w:p>
-            <w:r>
+            <w:tcW w:w="3277" w:type="dxa"/>
+            <w:tcBorders/>
+          </w:tcPr>
+          <w:p>
+            <w:pPr>
+              <w:pStyle w:val="Normal"/>
+              <w:widowControl/>
+              <w:suppressAutoHyphens w:val="true"/>
+              <w:bidi w:val="0"/>
+              <w:spacing w:lineRule="auto" w:line="259" w:before="0" w:after="160"/>
+              <w:jc w:val="left"/>
+              <w:rPr/>
+            </w:pPr>
+            <w:r>
+              <w:rPr/>
               <w:t>144 Wh/day</w:t>
             </w:r>
           </w:p>
         </w:tc>
         <w:tc>
           <w:tcPr>
-            <w:tcW w:type="dxa" w:w="3277"/>
-          </w:tcPr>
-          <w:p>
-            <w:r>
+            <w:tcW w:w="3277" w:type="dxa"/>
+            <w:tcBorders/>
+          </w:tcPr>
+          <w:p>
+            <w:pPr>
+              <w:pStyle w:val="Normal"/>
+              <w:widowControl/>
+              <w:suppressAutoHyphens w:val="true"/>
+              <w:bidi w:val="0"/>
+              <w:spacing w:lineRule="auto" w:line="259" w:before="0" w:after="160"/>
+              <w:jc w:val="left"/>
+              <w:rPr/>
+            </w:pPr>
+            <w:r>
+              <w:rPr/>
               <w:t>34.1 hours</w:t>
             </w:r>
           </w:p>
         </w:tc>
       </w:tr>
       <w:tr>
-        <w:tc>
-          <w:tcPr>
-            <w:tcW w:type="dxa" w:w="3277"/>
-          </w:tcPr>
-          <w:p>
-            <w:r>
+        <w:trPr/>
+        <w:tc>
+          <w:tcPr>
+            <w:tcW w:w="3277" w:type="dxa"/>
+            <w:tcBorders/>
+          </w:tcPr>
+          <w:p>
+            <w:pPr>
+              <w:pStyle w:val="Normal"/>
+              <w:widowControl/>
+              <w:suppressAutoHyphens w:val="true"/>
+              <w:bidi w:val="0"/>
+              <w:spacing w:lineRule="auto" w:line="259" w:before="0" w:after="160"/>
+              <w:jc w:val="left"/>
+              <w:rPr/>
+            </w:pPr>
+            <w:r>
+              <w:rPr/>
               <w:t>8 W</w:t>
             </w:r>
           </w:p>
         </w:tc>
         <w:tc>
           <w:tcPr>
-            <w:tcW w:type="dxa" w:w="3277"/>
-          </w:tcPr>
-          <w:p>
-            <w:r>
+            <w:tcW w:w="3277" w:type="dxa"/>
+            <w:tcBorders/>
+          </w:tcPr>
+          <w:p>
+            <w:pPr>
+              <w:pStyle w:val="Normal"/>
+              <w:widowControl/>
+              <w:suppressAutoHyphens w:val="true"/>
+              <w:bidi w:val="0"/>
+              <w:spacing w:lineRule="auto" w:line="259" w:before="0" w:after="160"/>
+              <w:jc w:val="left"/>
+              <w:rPr/>
+            </w:pPr>
+            <w:r>
+              <w:rPr/>
               <w:t>192 Wh/day</w:t>
             </w:r>
           </w:p>
         </w:tc>
         <w:tc>
           <w:tcPr>
-            <w:tcW w:type="dxa" w:w="3277"/>
-          </w:tcPr>
-          <w:p>
-            <w:r>
+            <w:tcW w:w="3277" w:type="dxa"/>
+            <w:tcBorders/>
+          </w:tcPr>
+          <w:p>
+            <w:pPr>
+              <w:pStyle w:val="Normal"/>
+              <w:widowControl/>
+              <w:suppressAutoHyphens w:val="true"/>
+              <w:bidi w:val="0"/>
+              <w:spacing w:lineRule="auto" w:line="259" w:before="0" w:after="160"/>
+              <w:jc w:val="left"/>
+              <w:rPr/>
+            </w:pPr>
+            <w:r>
+              <w:rPr/>
               <w:t>25.6 hours</w:t>
             </w:r>
           </w:p>
         </w:tc>
       </w:tr>
       <w:tr>
-        <w:tc>
-          <w:tcPr>
-            <w:tcW w:type="dxa" w:w="3277"/>
-          </w:tcPr>
-          <w:p>
-            <w:r>
+        <w:trPr/>
+        <w:tc>
+          <w:tcPr>
+            <w:tcW w:w="3277" w:type="dxa"/>
+            <w:tcBorders/>
+          </w:tcPr>
+          <w:p>
+            <w:pPr>
+              <w:pStyle w:val="Normal"/>
+              <w:widowControl/>
+              <w:suppressAutoHyphens w:val="true"/>
+              <w:bidi w:val="0"/>
+              <w:spacing w:lineRule="auto" w:line="259" w:before="0" w:after="160"/>
+              <w:jc w:val="left"/>
+              <w:rPr/>
+            </w:pPr>
+            <w:r>
+              <w:rPr/>
               <w:t>10 W</w:t>
             </w:r>
           </w:p>
         </w:tc>
         <w:tc>
           <w:tcPr>
-            <w:tcW w:type="dxa" w:w="3277"/>
-          </w:tcPr>
-          <w:p>
-            <w:r>
+            <w:tcW w:w="3277" w:type="dxa"/>
+            <w:tcBorders/>
+          </w:tcPr>
+          <w:p>
+            <w:pPr>
+              <w:pStyle w:val="Normal"/>
+              <w:widowControl/>
+              <w:suppressAutoHyphens w:val="true"/>
+              <w:bidi w:val="0"/>
+              <w:spacing w:lineRule="auto" w:line="259" w:before="0" w:after="160"/>
+              <w:jc w:val="left"/>
+              <w:rPr/>
+            </w:pPr>
+            <w:r>
+              <w:rPr/>
               <w:t>240 Wh/day</w:t>
             </w:r>
           </w:p>
         </w:tc>
         <w:tc>
           <w:tcPr>
-            <w:tcW w:type="dxa" w:w="3277"/>
-          </w:tcPr>
-          <w:p>
-            <w:r>
+            <w:tcW w:w="3277" w:type="dxa"/>
+            <w:tcBorders/>
+          </w:tcPr>
+          <w:p>
+            <w:pPr>
+              <w:pStyle w:val="Normal"/>
+              <w:widowControl/>
+              <w:suppressAutoHyphens w:val="true"/>
+              <w:bidi w:val="0"/>
+              <w:spacing w:lineRule="auto" w:line="259" w:before="0" w:after="160"/>
+              <w:jc w:val="left"/>
+              <w:rPr/>
+            </w:pPr>
+            <w:r>
+              <w:rPr/>
               <w:t>20.5 hours</w:t>
             </w:r>
           </w:p>
@@ -4005,20 +4480,37 @@
     <w:p>
       <w:pPr>
         <w:pStyle w:val="Heading2"/>
-      </w:pPr>
-      <w:r>
+        <w:spacing w:before="280" w:after="280"/>
+        <w:rPr/>
+      </w:pPr>
+      <w:r>
+        <w:rPr/>
         <w:t>22.3 Solar-Panel Sizing</w:t>
       </w:r>
     </w:p>
     <w:p>
-      <w:r>
+      <w:pPr>
+        <w:pStyle w:val="Normal"/>
+        <w:rPr/>
+      </w:pPr>
+      <w:r>
+        <w:rPr/>
         <w:t>Preliminary daily harvest uses panel rating × 4 peak-sun-hours × 70% net system efficiency. The 70% factor provisionally covers MPPT, wiring, conversion, temperature, orientation, and contamination losses; actual Puerto Princesa conditions must be logged.</w:t>
       </w:r>
     </w:p>
     <w:tbl>
       <w:tblPr>
-        <w:tblW w:type="auto" w:w="0"/>
-        <w:tblLook w:firstColumn="1" w:firstRow="1" w:lastColumn="0" w:lastRow="0" w:noHBand="0" w:noVBand="1" w:val="04A0"/>
+        <w:tblW w:w="9831" w:type="dxa"/>
+        <w:jc w:val="left"/>
+        <w:tblInd w:w="0" w:type="dxa"/>
+        <w:tblLayout w:type="fixed"/>
+        <w:tblCellMar>
+          <w:top w:w="0" w:type="dxa"/>
+          <w:left w:w="108" w:type="dxa"/>
+          <w:bottom w:w="0" w:type="dxa"/>
+          <w:right w:w="108" w:type="dxa"/>
+        </w:tblCellMar>
+        <w:tblLook w:val="04a0" w:noHBand="0" w:noVBand="1" w:firstColumn="1" w:lastRow="0" w:lastColumn="0" w:firstRow="1"/>
       </w:tblPr>
       <w:tblGrid>
         <w:gridCol w:w="3277"/>
@@ -4026,128 +4518,264 @@
         <w:gridCol w:w="3277"/>
       </w:tblGrid>
       <w:tr>
-        <w:tc>
-          <w:tcPr>
-            <w:tcW w:type="dxa" w:w="3277"/>
-          </w:tcPr>
-          <w:p>
-            <w:r>
+        <w:trPr/>
+        <w:tc>
+          <w:tcPr>
+            <w:tcW w:w="3277" w:type="dxa"/>
+            <w:tcBorders/>
+          </w:tcPr>
+          <w:p>
+            <w:pPr>
+              <w:pStyle w:val="Normal"/>
+              <w:widowControl/>
+              <w:suppressAutoHyphens w:val="true"/>
+              <w:bidi w:val="0"/>
+              <w:spacing w:lineRule="auto" w:line="259" w:before="0" w:after="160"/>
+              <w:jc w:val="left"/>
+              <w:rPr/>
+            </w:pPr>
+            <w:r>
+              <w:rPr/>
               <w:t>Solar option</w:t>
             </w:r>
           </w:p>
         </w:tc>
         <w:tc>
           <w:tcPr>
-            <w:tcW w:type="dxa" w:w="3277"/>
-          </w:tcPr>
-          <w:p>
-            <w:r>
+            <w:tcW w:w="3277" w:type="dxa"/>
+            <w:tcBorders/>
+          </w:tcPr>
+          <w:p>
+            <w:pPr>
+              <w:pStyle w:val="Normal"/>
+              <w:widowControl/>
+              <w:suppressAutoHyphens w:val="true"/>
+              <w:bidi w:val="0"/>
+              <w:spacing w:lineRule="auto" w:line="259" w:before="0" w:after="160"/>
+              <w:jc w:val="left"/>
+              <w:rPr/>
+            </w:pPr>
+            <w:r>
+              <w:rPr/>
               <w:t>Estimated harvest</w:t>
             </w:r>
           </w:p>
         </w:tc>
         <w:tc>
           <w:tcPr>
-            <w:tcW w:type="dxa" w:w="3277"/>
-          </w:tcPr>
-          <w:p>
-            <w:r>
+            <w:tcW w:w="3277" w:type="dxa"/>
+            <w:tcBorders/>
+          </w:tcPr>
+          <w:p>
+            <w:pPr>
+              <w:pStyle w:val="Normal"/>
+              <w:widowControl/>
+              <w:suppressAutoHyphens w:val="true"/>
+              <w:bidi w:val="0"/>
+              <w:spacing w:lineRule="auto" w:line="259" w:before="0" w:after="160"/>
+              <w:jc w:val="left"/>
+              <w:rPr/>
+            </w:pPr>
+            <w:r>
+              <w:rPr/>
               <w:t>Interpretation</w:t>
             </w:r>
           </w:p>
         </w:tc>
       </w:tr>
       <w:tr>
-        <w:tc>
-          <w:tcPr>
-            <w:tcW w:type="dxa" w:w="3277"/>
-          </w:tcPr>
-          <w:p>
-            <w:r>
+        <w:trPr/>
+        <w:tc>
+          <w:tcPr>
+            <w:tcW w:w="3277" w:type="dxa"/>
+            <w:tcBorders/>
+          </w:tcPr>
+          <w:p>
+            <w:pPr>
+              <w:pStyle w:val="Normal"/>
+              <w:widowControl/>
+              <w:suppressAutoHyphens w:val="true"/>
+              <w:bidi w:val="0"/>
+              <w:spacing w:lineRule="auto" w:line="259" w:before="0" w:after="160"/>
+              <w:jc w:val="left"/>
+              <w:rPr/>
+            </w:pPr>
+            <w:r>
+              <w:rPr/>
               <w:t>60 W nominal panel</w:t>
             </w:r>
           </w:p>
         </w:tc>
         <w:tc>
           <w:tcPr>
-            <w:tcW w:type="dxa" w:w="3277"/>
-          </w:tcPr>
-          <w:p>
-            <w:r>
+            <w:tcW w:w="3277" w:type="dxa"/>
+            <w:tcBorders/>
+          </w:tcPr>
+          <w:p>
+            <w:pPr>
+              <w:pStyle w:val="Normal"/>
+              <w:widowControl/>
+              <w:suppressAutoHyphens w:val="true"/>
+              <w:bidi w:val="0"/>
+              <w:spacing w:lineRule="auto" w:line="259" w:before="0" w:after="160"/>
+              <w:jc w:val="left"/>
+              <w:rPr/>
+            </w:pPr>
+            <w:r>
+              <w:rPr/>
               <w:t>168 Wh/day</w:t>
             </w:r>
           </w:p>
         </w:tc>
         <w:tc>
           <w:tcPr>
-            <w:tcW w:type="dxa" w:w="3277"/>
-          </w:tcPr>
-          <w:p>
-            <w:r>
+            <w:tcW w:w="3277" w:type="dxa"/>
+            <w:tcBorders/>
+          </w:tcPr>
+          <w:p>
+            <w:pPr>
+              <w:pStyle w:val="Normal"/>
+              <w:widowControl/>
+              <w:suppressAutoHyphens w:val="true"/>
+              <w:bidi w:val="0"/>
+              <w:spacing w:lineRule="auto" w:line="259" w:before="0" w:after="160"/>
+              <w:jc w:val="left"/>
+              <w:rPr/>
+            </w:pPr>
+            <w:r>
+              <w:rPr/>
               <w:t>Supervised-test minimum; supports a 6 W average load with only about 24 Wh/day theoretical margin</w:t>
             </w:r>
           </w:p>
         </w:tc>
       </w:tr>
       <w:tr>
-        <w:tc>
-          <w:tcPr>
-            <w:tcW w:type="dxa" w:w="3277"/>
-          </w:tcPr>
-          <w:p>
-            <w:r>
+        <w:trPr/>
+        <w:tc>
+          <w:tcPr>
+            <w:tcW w:w="3277" w:type="dxa"/>
+            <w:tcBorders/>
+          </w:tcPr>
+          <w:p>
+            <w:pPr>
+              <w:pStyle w:val="Normal"/>
+              <w:widowControl/>
+              <w:suppressAutoHyphens w:val="true"/>
+              <w:bidi w:val="0"/>
+              <w:spacing w:lineRule="auto" w:line="259" w:before="0" w:after="160"/>
+              <w:jc w:val="left"/>
+              <w:rPr/>
+            </w:pPr>
+            <w:r>
+              <w:rPr/>
               <w:t>80 W nominal panel</w:t>
             </w:r>
           </w:p>
         </w:tc>
         <w:tc>
           <w:tcPr>
-            <w:tcW w:type="dxa" w:w="3277"/>
-          </w:tcPr>
-          <w:p>
-            <w:r>
+            <w:tcW w:w="3277" w:type="dxa"/>
+            <w:tcBorders/>
+          </w:tcPr>
+          <w:p>
+            <w:pPr>
+              <w:pStyle w:val="Normal"/>
+              <w:widowControl/>
+              <w:suppressAutoHyphens w:val="true"/>
+              <w:bidi w:val="0"/>
+              <w:spacing w:lineRule="auto" w:line="259" w:before="0" w:after="160"/>
+              <w:jc w:val="left"/>
+              <w:rPr/>
+            </w:pPr>
+            <w:r>
+              <w:rPr/>
               <w:t>224 Wh/day</w:t>
             </w:r>
           </w:p>
         </w:tc>
         <w:tc>
           <w:tcPr>
-            <w:tcW w:type="dxa" w:w="3277"/>
-          </w:tcPr>
-          <w:p>
-            <w:r>
+            <w:tcW w:w="3277" w:type="dxa"/>
+            <w:tcBorders/>
+          </w:tcPr>
+          <w:p>
+            <w:pPr>
+              <w:pStyle w:val="Normal"/>
+              <w:widowControl/>
+              <w:suppressAutoHyphens w:val="true"/>
+              <w:bidi w:val="0"/>
+              <w:spacing w:lineRule="auto" w:line="259" w:before="0" w:after="160"/>
+              <w:jc w:val="left"/>
+              <w:rPr/>
+            </w:pPr>
+            <w:r>
+              <w:rPr/>
               <w:t>Preferred prototype starting point; about 80 Wh/day margin at 6 W or 32 Wh/day at 8 W</w:t>
             </w:r>
           </w:p>
         </w:tc>
       </w:tr>
       <w:tr>
-        <w:tc>
-          <w:tcPr>
-            <w:tcW w:type="dxa" w:w="3277"/>
-          </w:tcPr>
-          <w:p>
-            <w:r>
+        <w:trPr/>
+        <w:tc>
+          <w:tcPr>
+            <w:tcW w:w="3277" w:type="dxa"/>
+            <w:tcBorders/>
+          </w:tcPr>
+          <w:p>
+            <w:pPr>
+              <w:pStyle w:val="Normal"/>
+              <w:widowControl/>
+              <w:suppressAutoHyphens w:val="true"/>
+              <w:bidi w:val="0"/>
+              <w:spacing w:lineRule="auto" w:line="259" w:before="0" w:after="160"/>
+              <w:jc w:val="left"/>
+              <w:rPr/>
+            </w:pPr>
+            <w:r>
+              <w:rPr/>
               <w:t>LiFePO4-compatible MPPT</w:t>
             </w:r>
           </w:p>
         </w:tc>
         <w:tc>
           <w:tcPr>
-            <w:tcW w:type="dxa" w:w="3277"/>
-          </w:tcPr>
-          <w:p>
-            <w:r>
+            <w:tcW w:w="3277" w:type="dxa"/>
+            <w:tcBorders/>
+          </w:tcPr>
+          <w:p>
+            <w:pPr>
+              <w:pStyle w:val="Normal"/>
+              <w:widowControl/>
+              <w:suppressAutoHyphens w:val="true"/>
+              <w:bidi w:val="0"/>
+              <w:spacing w:lineRule="auto" w:line="259" w:before="0" w:after="160"/>
+              <w:jc w:val="left"/>
+              <w:rPr/>
+            </w:pPr>
+            <w:r>
+              <w:rPr/>
               <w:t>Exact model TBD</w:t>
             </w:r>
           </w:p>
         </w:tc>
         <w:tc>
           <w:tcPr>
-            <w:tcW w:type="dxa" w:w="3277"/>
-          </w:tcPr>
-          <w:p>
-            <w:r>
+            <w:tcW w:w="3277" w:type="dxa"/>
+            <w:tcBorders/>
+          </w:tcPr>
+          <w:p>
+            <w:pPr>
+              <w:pStyle w:val="Normal"/>
+              <w:widowControl/>
+              <w:suppressAutoHyphens w:val="true"/>
+              <w:bidi w:val="0"/>
+              <w:spacing w:lineRule="auto" w:line="259" w:before="0" w:after="160"/>
+              <w:jc w:val="left"/>
+              <w:rPr/>
+            </w:pPr>
+            <w:r>
+              <w:rPr/>
               <w:t>Panel Voc/Isc, charge profile, current rating, thermal behavior, and protection must be verified</w:t>
             </w:r>
           </w:p>
@@ -4155,7 +4783,12 @@
       </w:tr>
     </w:tbl>
     <w:p>
-      <w:r>
+      <w:pPr>
+        <w:pStyle w:val="Normal"/>
+        <w:rPr/>
+      </w:pPr>
+      <w:r>
+        <w:rPr/>
         <w:t>These calculations are provisional sizing values, not validated endurance claims. Do not approve unattended deployment until the system passes a 24-hour load measurement, converter/brownout tests, and at least a 72-hour solar-endurance trial.</w:t>
       </w:r>
     </w:p>
@@ -4702,6 +5335,7 @@
               <w:rPr/>
             </w:pPr>
             <w:r>
+              <w:rPr/>
               <w:t>Provide simplified four-page browser dashboard.</w:t>
             </w:r>
           </w:p>
@@ -5163,42 +5797,87 @@
         </w:tc>
       </w:tr>
       <w:tr>
-        <w:tc>
-          <w:tcPr>
-            <w:tcW w:type="dxa" w:w="2256"/>
-          </w:tcPr>
-          <w:p>
-            <w:r>
+        <w:trPr/>
+        <w:tc>
+          <w:tcPr>
+            <w:tcW w:w="2256" w:type="dxa"/>
+            <w:tcBorders/>
+          </w:tcPr>
+          <w:p>
+            <w:pPr>
+              <w:pStyle w:val="Normal"/>
+              <w:widowControl/>
+              <w:suppressAutoHyphens w:val="true"/>
+              <w:bidi w:val="0"/>
+              <w:spacing w:lineRule="auto" w:line="259" w:before="0" w:after="160"/>
+              <w:jc w:val="left"/>
+              <w:rPr/>
+            </w:pPr>
+            <w:r>
+              <w:rPr/>
               <w:t>FR-08</w:t>
             </w:r>
           </w:p>
         </w:tc>
         <w:tc>
           <w:tcPr>
-            <w:tcW w:type="dxa" w:w="2256"/>
-          </w:tcPr>
-          <w:p>
-            <w:r>
+            <w:tcW w:w="2256" w:type="dxa"/>
+            <w:tcBorders/>
+          </w:tcPr>
+          <w:p>
+            <w:pPr>
+              <w:pStyle w:val="Normal"/>
+              <w:widowControl/>
+              <w:suppressAutoHyphens w:val="true"/>
+              <w:bidi w:val="0"/>
+              <w:spacing w:lineRule="auto" w:line="259" w:before="0" w:after="160"/>
+              <w:jc w:val="left"/>
+              <w:rPr/>
+            </w:pPr>
+            <w:r>
+              <w:rPr/>
               <w:t>Acquire sealed-probe water temperature with explicit validity and freshness states.</w:t>
             </w:r>
           </w:p>
         </w:tc>
         <w:tc>
           <w:tcPr>
-            <w:tcW w:type="dxa" w:w="2256"/>
-          </w:tcPr>
-          <w:p>
-            <w:r>
+            <w:tcW w:w="2256" w:type="dxa"/>
+            <w:tcBorders/>
+          </w:tcPr>
+          <w:p>
+            <w:pPr>
+              <w:pStyle w:val="Normal"/>
+              <w:widowControl/>
+              <w:suppressAutoHyphens w:val="true"/>
+              <w:bidi w:val="0"/>
+              <w:spacing w:lineRule="auto" w:line="259" w:before="0" w:after="160"/>
+              <w:jc w:val="left"/>
+              <w:rPr/>
+            </w:pPr>
+            <w:r>
+              <w:rPr/>
               <w:t>DS18B20 reference comparison, stale/disconnect tests, and correct dashboard labels.</w:t>
             </w:r>
           </w:p>
         </w:tc>
         <w:tc>
           <w:tcPr>
-            <w:tcW w:type="dxa" w:w="2255"/>
-          </w:tcPr>
-          <w:p>
-            <w:r>
+            <w:tcW w:w="2255" w:type="dxa"/>
+            <w:tcBorders/>
+          </w:tcPr>
+          <w:p>
+            <w:pPr>
+              <w:pStyle w:val="Normal"/>
+              <w:widowControl/>
+              <w:suppressAutoHyphens w:val="true"/>
+              <w:bidi w:val="0"/>
+              <w:spacing w:lineRule="auto" w:line="259" w:before="0" w:after="160"/>
+              <w:jc w:val="left"/>
+              <w:rPr/>
+            </w:pPr>
+            <w:r>
+              <w:rPr/>
               <w:t>Required</w:t>
             </w:r>
           </w:p>
@@ -5315,6 +5994,7 @@
         <w:rPr/>
       </w:pPr>
       <w:r>
+        <w:rPr/>
         <w:t>Sensors → ESP32 acquisition/validation → USB serial/UART → Orange Pi local processing/storage/API → local dashboard → user. The saved FALCON Assistant is currently disabled; if re-enabled, it may consume validated system state but shall never control or replace the core monitoring pipeline.</w:t>
       </w:r>
     </w:p>
@@ -5335,6 +6015,7 @@
         <w:rPr/>
       </w:pPr>
       <w:r>
+        <w:rPr/>
         <w:t>The following items remain intentionally unresolved and should not be treated as final until exact hardware, datasheets, fabrication constraints, and controlled tests are available: exact GPS model; exact wind-speed and wind-direction sensor models; tamper sensor type; enclosure switch and buzzer electrical ratings; pressure-sensor mounting depth; solar-panel rating; MPPT model; battery capacity; converter and fuse ratings; final PCB connectors and pinout; mooring line material/length/scope; and the independent wave-reference method.</w:t>
       </w:r>
     </w:p>

</xml_diff>

<commit_message>
Align thesis materials with v6.1 baseline
</commit_message>
<xml_diff>
--- a/THESIS DOCUMENTATION/PROJECT FALCON-01 - V3 Documentation.docx
+++ b/THESIS DOCUMENTATION/PROJECT FALCON-01 - V3 Documentation.docx
@@ -2775,7 +2775,7 @@
         <w:rPr/>
       </w:pPr>
       <w:r>
-        <w:t>2. Buoy Motion: an optional 3D visualization whose water-surface amplitude, heave, and tilt are generated from pressure-based estimated wave height. GPS supplies heading context only; no IMU, roll, or pitch sensor input is used. Current Data uses the received estimate; Calm, Moderate, Rough, and Pressure Offline are clearly labeled local presentation presets that never modify stored or live telemetry.</w:t>
+        <w:t>2. Buoy Motion: an optional 3D visualization whose water-surface amplitude, heave, and tilt are generated from pressure-based estimated wave height. GPS supplies heading context only; no IMU, roll, or pitch sensor input is used. Current Data uses the received estimate; Calm, Moderate, Rough, and Pressure Offline are clearly labeled local presentation presets that never modify stored or live telemetry. Current Data uses the received estimate; Calm, Moderate, Rough, and Pressure Offline are clearly labeled local presentation presets that never modify stored or live telemetry. Current Data uses the received estimate; Calm, Moderate, Rough, and Pressure Offline are clearly labeled local presentation presets that never modify stored or live telemetry.</w:t>
       </w:r>
     </w:p>
     <w:p>
@@ -3486,8 +3486,7 @@
         <w:rPr/>
       </w:pPr>
       <w:r>
-        <w:rPr/>
-        <w:t>This V3.3 implementation-aligned document supersedes conflicting V2 and earlier V3 descriptions. The repository master context is docs/PROJECT_CONTEXT.md v6.0. Older CAD, Wokwi, motion, IMU, forecast, and PCB records may remain for historical traceability but are not the current required Phase 1 baseline unless revised and explicitly approved. Sections 22–27 and Figures 1–6 are part of the current documentation baseline and must remain consistent with docs/PROJECT_CONTEXT.md and the implemented repository.</w:t>
+        <w:t>This V3.3 implementation-aligned document supersedes conflicting V2 and earlier V3 descriptions. The repository master context is docs/PROJECT_CONTEXT.md v6.1. Older CAD, Wokwi, motion, IMU, forecast, and PCB records may remain for historical traceability but are not the current required Phase 1 baseline unless revised and explicitly approved. Sections 22–27 and Figures 1–6 are part of the current documentation baseline and must remain consistent with docs/PROJECT_CONTEXT.md and the implemented repository. The physical and visual prototype is under redesign. Old CAD dimensions, component placement, solar arrangement, cooling geometry, and renders are historical references until adviser approval.</w:t>
       </w:r>
     </w:p>
     <w:p>

</xml_diff>